<commit_message>
Module 11: teach creating a fresh MAUI project
</commit_message>
<xml_diff>
--- a/Tutorials/MAUI_IoT_Project_Cost_Estimator_11_Module_Arc.docx
+++ b/Tutorials/MAUI_IoT_Project_Cost_Estimator_11_Module_Arc.docx
@@ -286,7 +286,7 @@
     </w:p>
     <w:p>
       <w:r>
-        <w:t>Rebuild the full app from a clean MAUI starter using the final architecture.</w:t>
+        <w:t>Create a new .NET MAUI App in Visual Studio and rebuild the full app using the final architecture.</w:t>
       </w:r>
     </w:p>
     <w:p>
@@ -328,7 +328,7 @@
     </w:p>
     <w:p>
       <w:r>
-        <w:t>Modules 1 through 11 each have a Word tutorial and captured app screens in the curriculum folder. The Module 11 branch also contains Module11Starter, Module11Reference, and Module11Reference.Tests. Feature branches for Modules 8 through 11 are pushed separately so each lesson can be reviewed at its own endpoint.</w:t>
+        <w:t>Modules 1 through 11 each have a Word tutorial and captured app screens in the curriculum folder. Module 11 begins by creating a new project in Visual Studio; the branch contains Module11Reference and Module11Reference.Tests for comparison. Feature branches for Modules 8 through 11 are pushed separately so each lesson can be reviewed at its own endpoint.</w:t>
       </w:r>
     </w:p>
     <w:sectPr>

</xml_diff>